<commit_message>
v0.2.1-alpha — filing-grade format calibration (inherits HC v0.2.1)
- fix_docx_tables.py post-pandoc table-width forcer
- Heading 2 with UNDERLINE for spaced section headers
- Heading 3 + Heading 4 styles for unspaced bold-underlined + left-anchored
- Drafter pandoc command is two-step (pandoc + fix script)
</commit_message>
<xml_diff>
--- a/skills/_rent_control_drafting_base/reference.docx
+++ b/skills/_rent_control_drafting_base/reference.docx
@@ -20,7 +20,7 @@
     </w:p>
     <w:p>
       <w:r>
-        <w:t>(Style template — pandoc replaces this content. Body paragraphs render in Times New Roman 14pt, 1.5 line spacing, justified, with 0.5cm first-line indent.)</w:t>
+        <w:t>Style template — pandoc replaces this body. Normal style: TNR 14pt 1.5 spacing justified 0.5cm first-line indent.</w:t>
       </w:r>
     </w:p>
     <w:p>
@@ -33,15 +33,7 @@
     </w:p>
     <w:p>
       <w:r>
-        <w:t>This is body text inside the F A C T S section. Pandoc applies this style automatically when the markdown source uses a Heading 2 (`## F A C T S`).</w:t>
-      </w:r>
-    </w:p>
-    <w:p>
-      <w:pPr>
-        <w:pStyle w:val="Heading2"/>
-      </w:pPr>
-      <w:r>
-        <w:t>G R O U N D S</w:t>
+        <w:t>Body inside F A C T S section.</w:t>
       </w:r>
     </w:p>
     <w:p>
@@ -49,329 +41,29 @@
         <w:pStyle w:val="Heading3"/>
       </w:pPr>
       <w:r>
-        <w:t>Ground I — opening</w:t>
+        <w:t>ACTS &amp; RULES</w:t>
       </w:r>
     </w:p>
     <w:p>
       <w:r>
-        <w:t>This is body text inside a numbered ground. Pandoc applies this style automatically.</w:t>
+        <w:t>Indian Evidence Act 1872 / Civil Procedure Code 1908</w:t>
       </w:r>
     </w:p>
-    <w:tbl>
-      <w:tblPr>
-        <w:tblStyle w:val="TableGrid"/>
-        <w:tblW w:type="auto" w:w="0"/>
-        <w:tblLayout w:type="fixed"/>
-        <w:tblLook w:firstColumn="1" w:firstRow="1" w:lastColumn="0" w:lastRow="0" w:noHBand="0" w:noVBand="1" w:val="04A0"/>
-        <w:tblLayout w:type="fixed"/>
-      </w:tblPr>
-      <w:tblGrid>
-        <w:gridCol w:w="1644"/>
-        <w:gridCol w:w="1644"/>
-        <w:gridCol w:w="1644"/>
-        <w:gridCol w:w="1644"/>
-        <w:gridCol w:w="1644"/>
-      </w:tblGrid>
-      <w:tr>
-        <w:tc>
-          <w:tcPr>
-            <w:tcW w:type="dxa" w:w="658"/>
-            <w:vAlign w:val="center"/>
-          </w:tcPr>
-          <w:p>
-            <w:pPr>
-              <w:ind w:firstLine="0"/>
-              <w:jc w:val="center"/>
-            </w:pPr>
-            <w:r/>
-            <w:r>
-              <w:rPr>
-                <w:rFonts w:ascii="Times New Roman" w:hAnsi="Times New Roman"/>
-                <w:b/>
-                <w:sz w:val="28"/>
-              </w:rPr>
-              <w:t>Sr.No</w:t>
-            </w:r>
-          </w:p>
-        </w:tc>
-        <w:tc>
-          <w:tcPr>
-            <w:tcW w:type="dxa" w:w="658"/>
-            <w:vAlign w:val="center"/>
-          </w:tcPr>
-          <w:p>
-            <w:pPr>
-              <w:ind w:firstLine="0"/>
-              <w:jc w:val="center"/>
-            </w:pPr>
-            <w:r/>
-            <w:r>
-              <w:rPr>
-                <w:rFonts w:ascii="Times New Roman" w:hAnsi="Times New Roman"/>
-                <w:b/>
-                <w:sz w:val="28"/>
-              </w:rPr>
-              <w:t>Annx</w:t>
-            </w:r>
-          </w:p>
-        </w:tc>
-        <w:tc>
-          <w:tcPr>
-            <w:tcW w:type="dxa" w:w="5097"/>
-            <w:vAlign w:val="center"/>
-          </w:tcPr>
-          <w:p>
-            <w:pPr>
-              <w:ind w:firstLine="0"/>
-              <w:jc w:val="center"/>
-            </w:pPr>
-            <w:r/>
-            <w:r>
-              <w:rPr>
-                <w:rFonts w:ascii="Times New Roman" w:hAnsi="Times New Roman"/>
-                <w:b/>
-                <w:sz w:val="28"/>
-              </w:rPr>
-              <w:t>Particulars</w:t>
-            </w:r>
-          </w:p>
-        </w:tc>
-        <w:tc>
-          <w:tcPr>
-            <w:tcW w:type="dxa" w:w="986"/>
-            <w:vAlign w:val="center"/>
-          </w:tcPr>
-          <w:p>
-            <w:pPr>
-              <w:ind w:firstLine="0"/>
-              <w:jc w:val="center"/>
-            </w:pPr>
-            <w:r/>
-            <w:r>
-              <w:rPr>
-                <w:rFonts w:ascii="Times New Roman" w:hAnsi="Times New Roman"/>
-                <w:b/>
-                <w:sz w:val="28"/>
-              </w:rPr>
-              <w:t>Date</w:t>
-            </w:r>
-          </w:p>
-        </w:tc>
-        <w:tc>
-          <w:tcPr>
-            <w:tcW w:type="dxa" w:w="822"/>
-            <w:vAlign w:val="center"/>
-          </w:tcPr>
-          <w:p>
-            <w:pPr>
-              <w:ind w:firstLine="0"/>
-              <w:jc w:val="center"/>
-            </w:pPr>
-            <w:r/>
-            <w:r>
-              <w:rPr>
-                <w:rFonts w:ascii="Times New Roman" w:hAnsi="Times New Roman"/>
-                <w:b/>
-                <w:sz w:val="28"/>
-              </w:rPr>
-              <w:t>Pgs</w:t>
-            </w:r>
-          </w:p>
-        </w:tc>
-      </w:tr>
-      <w:tr>
-        <w:tc>
-          <w:tcPr>
-            <w:tcW w:type="dxa" w:w="658"/>
-            <w:vAlign w:val="center"/>
-          </w:tcPr>
-          <w:p>
-            <w:pPr>
-              <w:ind w:firstLine="0"/>
-            </w:pPr>
-            <w:r/>
-            <w:r>
-              <w:rPr>
-                <w:rFonts w:ascii="Times New Roman" w:hAnsi="Times New Roman"/>
-                <w:sz w:val="28"/>
-              </w:rPr>
-              <w:t>1.</w:t>
-            </w:r>
-          </w:p>
-        </w:tc>
-        <w:tc>
-          <w:tcPr>
-            <w:tcW w:type="dxa" w:w="658"/>
-            <w:vAlign w:val="center"/>
-          </w:tcPr>
-          <w:p>
-            <w:pPr>
-              <w:ind w:firstLine="0"/>
-            </w:pPr>
-            <w:r/>
-            <w:r>
-              <w:rPr>
-                <w:rFonts w:ascii="Times New Roman" w:hAnsi="Times New Roman"/>
-                <w:sz w:val="28"/>
-              </w:rPr>
-            </w:r>
-          </w:p>
-        </w:tc>
-        <w:tc>
-          <w:tcPr>
-            <w:tcW w:type="dxa" w:w="5097"/>
-            <w:vAlign w:val="center"/>
-          </w:tcPr>
-          <w:p>
-            <w:pPr>
-              <w:ind w:firstLine="0"/>
-            </w:pPr>
-            <w:r/>
-            <w:r>
-              <w:rPr>
-                <w:rFonts w:ascii="Times New Roman" w:hAnsi="Times New Roman"/>
-                <w:sz w:val="28"/>
-              </w:rPr>
-              <w:t>Synopsis</w:t>
-            </w:r>
-          </w:p>
-        </w:tc>
-        <w:tc>
-          <w:tcPr>
-            <w:tcW w:type="dxa" w:w="986"/>
-            <w:vAlign w:val="center"/>
-          </w:tcPr>
-          <w:p>
-            <w:pPr>
-              <w:ind w:firstLine="0"/>
-            </w:pPr>
-            <w:r/>
-            <w:r>
-              <w:rPr>
-                <w:rFonts w:ascii="Times New Roman" w:hAnsi="Times New Roman"/>
-                <w:sz w:val="28"/>
-              </w:rPr>
-            </w:r>
-          </w:p>
-        </w:tc>
-        <w:tc>
-          <w:tcPr>
-            <w:tcW w:type="dxa" w:w="822"/>
-            <w:vAlign w:val="center"/>
-          </w:tcPr>
-          <w:p>
-            <w:pPr>
-              <w:ind w:firstLine="0"/>
-            </w:pPr>
-            <w:r/>
-            <w:r>
-              <w:rPr>
-                <w:rFonts w:ascii="Times New Roman" w:hAnsi="Times New Roman"/>
-                <w:sz w:val="28"/>
-              </w:rPr>
-            </w:r>
-          </w:p>
-        </w:tc>
-      </w:tr>
-      <w:tr>
-        <w:tc>
-          <w:tcPr>
-            <w:tcW w:type="dxa" w:w="658"/>
-            <w:vAlign w:val="center"/>
-          </w:tcPr>
-          <w:p>
-            <w:pPr>
-              <w:ind w:firstLine="0"/>
-            </w:pPr>
-            <w:r/>
-            <w:r>
-              <w:rPr>
-                <w:rFonts w:ascii="Times New Roman" w:hAnsi="Times New Roman"/>
-                <w:sz w:val="28"/>
-              </w:rPr>
-              <w:t>2.</w:t>
-            </w:r>
-          </w:p>
-        </w:tc>
-        <w:tc>
-          <w:tcPr>
-            <w:tcW w:type="dxa" w:w="658"/>
-            <w:vAlign w:val="center"/>
-          </w:tcPr>
-          <w:p>
-            <w:pPr>
-              <w:ind w:firstLine="0"/>
-            </w:pPr>
-            <w:r/>
-            <w:r>
-              <w:rPr>
-                <w:rFonts w:ascii="Times New Roman" w:hAnsi="Times New Roman"/>
-                <w:sz w:val="28"/>
-              </w:rPr>
-              <w:t>A</w:t>
-            </w:r>
-          </w:p>
-        </w:tc>
-        <w:tc>
-          <w:tcPr>
-            <w:tcW w:type="dxa" w:w="5097"/>
-            <w:vAlign w:val="center"/>
-          </w:tcPr>
-          <w:p>
-            <w:pPr>
-              <w:ind w:firstLine="0"/>
-            </w:pPr>
-            <w:r/>
-            <w:r>
-              <w:rPr>
-                <w:rFonts w:ascii="Times New Roman" w:hAnsi="Times New Roman"/>
-                <w:sz w:val="28"/>
-              </w:rPr>
-              <w:t>Sample annexure row</w:t>
-            </w:r>
-          </w:p>
-        </w:tc>
-        <w:tc>
-          <w:tcPr>
-            <w:tcW w:type="dxa" w:w="986"/>
-            <w:vAlign w:val="center"/>
-          </w:tcPr>
-          <w:p>
-            <w:pPr>
-              <w:ind w:firstLine="0"/>
-            </w:pPr>
-            <w:r/>
-            <w:r>
-              <w:rPr>
-                <w:rFonts w:ascii="Times New Roman" w:hAnsi="Times New Roman"/>
-                <w:sz w:val="28"/>
-              </w:rPr>
-              <w:t>20.10.2025</w:t>
-            </w:r>
-          </w:p>
-        </w:tc>
-        <w:tc>
-          <w:tcPr>
-            <w:tcW w:type="dxa" w:w="822"/>
-            <w:vAlign w:val="center"/>
-          </w:tcPr>
-          <w:p>
-            <w:pPr>
-              <w:ind w:firstLine="0"/>
-            </w:pPr>
-            <w:r/>
-            <w:r>
-              <w:rPr>
-                <w:rFonts w:ascii="Times New Roman" w:hAnsi="Times New Roman"/>
-                <w:sz w:val="28"/>
-              </w:rPr>
-            </w:r>
-          </w:p>
-        </w:tc>
-      </w:tr>
-    </w:tbl>
+    <w:p>
+      <w:pPr>
+        <w:pStyle w:val="Heading4"/>
+      </w:pPr>
+      <w:r>
+        <w:t>MOST RESPECTFULLY SHEWETH:</w:t>
+      </w:r>
+    </w:p>
+    <w:p>
+      <w:r>
+        <w:t>Body following Heading 4.</w:t>
+      </w:r>
+    </w:p>
     <w:sectPr>
-      <w:footerReference w:type="default" r:id="rId9"/>
+      <w:headerReference w:type="default" r:id="rId9"/>
       <w:pgSz w:w="11906" w:h="16838"/>
       <w:pgMar w:top="1417" w:right="1417" w:bottom="1417" w:left="2268" w:header="720" w:footer="720" w:gutter="0"/>
       <w:cols w:space="720"/>
@@ -381,24 +73,24 @@
 </w:document>
 </file>
 
-<file path=word/footer1.xml><?xml version="1.0" encoding="utf-8"?>
-<w:ftr xmlns:m="http://schemas.openxmlformats.org/officeDocument/2006/math" xmlns:mc="http://schemas.openxmlformats.org/markup-compatibility/2006" xmlns:mo="http://schemas.microsoft.com/office/mac/office/2008/main" xmlns:mv="urn:schemas-microsoft-com:mac:vml" xmlns:o="urn:schemas-microsoft-com:office:office" xmlns:r="http://schemas.openxmlformats.org/officeDocument/2006/relationships" xmlns:v="urn:schemas-microsoft-com:vml" xmlns:w10="urn:schemas-microsoft-com:office:word" xmlns:w14="http://schemas.microsoft.com/office/word/2010/wordml" xmlns:w="http://schemas.openxmlformats.org/wordprocessingml/2006/main" xmlns:wne="http://schemas.microsoft.com/office/word/2006/wordml" xmlns:wp14="http://schemas.microsoft.com/office/word/2010/wordprocessingDrawing" xmlns:wp="http://schemas.openxmlformats.org/drawingml/2006/wordprocessingDrawing" xmlns:wpc="http://schemas.microsoft.com/office/word/2010/wordprocessingCanvas" xmlns:wpg="http://schemas.microsoft.com/office/word/2010/wordprocessingGroup" xmlns:wpi="http://schemas.microsoft.com/office/word/2010/wordprocessingInk" xmlns:wps="http://schemas.microsoft.com/office/word/2010/wordprocessingShape" mc:Ignorable="w14 wp14">
+<file path=word/header1.xml><?xml version="1.0" encoding="utf-8"?>
+<w:hdr xmlns:m="http://schemas.openxmlformats.org/officeDocument/2006/math" xmlns:mc="http://schemas.openxmlformats.org/markup-compatibility/2006" xmlns:mo="http://schemas.microsoft.com/office/mac/office/2008/main" xmlns:mv="urn:schemas-microsoft-com:mac:vml" xmlns:o="urn:schemas-microsoft-com:office:office" xmlns:r="http://schemas.openxmlformats.org/officeDocument/2006/relationships" xmlns:v="urn:schemas-microsoft-com:vml" xmlns:w10="urn:schemas-microsoft-com:office:word" xmlns:w14="http://schemas.microsoft.com/office/word/2010/wordml" xmlns:w="http://schemas.openxmlformats.org/wordprocessingml/2006/main" xmlns:wne="http://schemas.microsoft.com/office/word/2006/wordml" xmlns:wp14="http://schemas.microsoft.com/office/word/2010/wordprocessingDrawing" xmlns:wp="http://schemas.openxmlformats.org/drawingml/2006/wordprocessingDrawing" xmlns:wpc="http://schemas.microsoft.com/office/word/2010/wordprocessingCanvas" xmlns:wpg="http://schemas.microsoft.com/office/word/2010/wordprocessingGroup" xmlns:wpi="http://schemas.microsoft.com/office/word/2010/wordprocessingInk" xmlns:wps="http://schemas.microsoft.com/office/word/2010/wordprocessingShape" mc:Ignorable="w14 wp14">
   <w:p>
     <w:pPr>
-      <w:pStyle w:val="Footer"/>
+      <w:pStyle w:val="Header"/>
       <w:jc w:val="center"/>
     </w:pPr>
     <w:r>
       <w:rPr>
         <w:rFonts w:ascii="Times New Roman" w:hAnsi="Times New Roman"/>
-        <w:sz w:val="22"/>
+        <w:sz w:val="24"/>
       </w:rPr>
       <w:fldChar w:fldCharType="begin"/>
       <w:instrText xml:space="preserve">PAGE</w:instrText>
       <w:fldChar w:fldCharType="end"/>
     </w:r>
   </w:p>
-</w:ftr>
+</w:hdr>
 </file>
 
 <file path=word/numbering.xml><?xml version="1.0" encoding="utf-8"?>
@@ -871,6 +563,7 @@
       <w:szCs w:val="26"/>
       <w:rFonts w:ascii="Times New Roman" w:hAnsi="Times New Roman" w:cs="Times New Roman" w:eastAsia="Times New Roman"/>
       <w:spacing w:val="80"/>
+      <w:u w:val="single"/>
     </w:rPr>
   </w:style>
   <w:style w:type="paragraph" w:styleId="Heading3">
@@ -887,7 +580,7 @@
       <w:keepLines/>
       <w:spacing w:before="240" w:after="120" w:line="360" w:lineRule="auto"/>
       <w:ind w:firstLine="0"/>
-      <w:jc w:val="left"/>
+      <w:jc w:val="center"/>
       <w:outlineLvl w:val="2"/>
     </w:pPr>
     <w:rPr>
@@ -896,6 +589,7 @@
       <w:color w:val="000000"/>
       <w:sz w:val="28"/>
       <w:rFonts w:ascii="Times New Roman" w:hAnsi="Times New Roman" w:cs="Times New Roman" w:eastAsia="Times New Roman"/>
+      <w:u w:val="single"/>
     </w:rPr>
   </w:style>
   <w:style w:type="paragraph" w:styleId="Heading4">
@@ -911,16 +605,20 @@
     <w:pPr>
       <w:keepNext/>
       <w:keepLines/>
-      <w:spacing w:before="200" w:after="0"/>
+      <w:spacing w:before="240" w:after="120" w:line="360" w:lineRule="auto"/>
+      <w:ind w:firstLine="0"/>
+      <w:jc w:val="left"/>
       <w:outlineLvl w:val="3"/>
     </w:pPr>
     <w:rPr>
-      <w:rFonts w:asciiTheme="majorHAnsi" w:eastAsiaTheme="majorEastAsia" w:hAnsiTheme="majorHAnsi" w:cstheme="majorBidi"/>
       <w:b/>
       <w:bCs/>
       <w:i/>
       <w:iCs/>
-      <w:color w:val="4F81BD" w:themeColor="accent1"/>
+      <w:color w:val="000000"/>
+      <w:sz w:val="28"/>
+      <w:rFonts w:ascii="Times New Roman" w:hAnsi="Times New Roman" w:cs="Times New Roman" w:eastAsia="Times New Roman"/>
+      <w:u w:val="single"/>
     </w:rPr>
   </w:style>
   <w:style w:type="paragraph" w:styleId="Heading5">
@@ -1130,7 +828,7 @@
       <w:pBdr>
         <w:bottom w:val="single" w:sz="8" w:space="4" w:color="4F81BD" w:themeColor="accent1"/>
       </w:pBdr>
-      <w:spacing w:after="120" w:line="360" w:lineRule="auto" w:before="0"/>
+      <w:spacing w:after="240" w:line="360" w:lineRule="auto" w:before="240"/>
       <w:ind w:firstLine="0"/>
       <w:contextualSpacing/>
       <w:jc w:val="center"/>
@@ -1143,6 +841,7 @@
       <w:sz w:val="28"/>
       <w:szCs w:val="52"/>
       <w:rFonts w:ascii="Times New Roman" w:hAnsi="Times New Roman" w:cs="Times New Roman" w:eastAsia="Times New Roman"/>
+      <w:u w:val="single"/>
     </w:rPr>
   </w:style>
   <w:style w:type="character" w:customStyle="1" w:styleId="TitleChar">

</xml_diff>